<commit_message>
Withdraw the olmoearth_lcc annotated points as a candidate expert reference: the dataset card states they trained the LCC model (in-sample); roadmap item 5, facts, lab log and report corrected
</commit_message>
<xml_diff>
--- a/reports/2026-09-02_experiments_exp01-21.docx
+++ b/reports/2026-09-02_experiments_exp01-21.docx
@@ -2025,7 +2025,7 @@
         <w:spacing w:after="80"/>
       </w:pPr>
       <w:r>
-        <w:t xml:space="preserve">The served production output was assessed against WorldCover and label-free only; the olmoearth_lcc dataset's own annotated change points, which would be expert labels on the production model's output, have not been used yet.</w:t>
+        <w:t xml:space="preserve">The served production output was assessed against WorldCover and label-free only; the olmoearth_lcc dataset's annotated points are the model's training labels, so no held-out expert reference exists for it yet.</w:t>
       </w:r>
     </w:p>
     <w:p>
@@ -2047,7 +2047,7 @@
         <w:spacing w:after="80"/>
       </w:pPr>
       <w:r>
-        <w:t xml:space="preserve">Score the served change product's band 1 against the dataset's annotated change points: expert labels on the production model's own output.</w:t>
+        <w:t xml:space="preserve">Find an independent expert reference for the served change product; the olmoearth_lcc annotated points are the model's training labels and cannot serve as a held-out test.</w:t>
       </w:r>
     </w:p>
     <w:p>

</xml_diff>